<commit_message>
fix: the Cover Page merges the school year — S.Y. hardcode becomes ${school_year}
</commit_message>
<xml_diff>
--- a/public/documents/templates/cas/cover-page-template.docx
+++ b/public/documents/templates/cas/cover-page-template.docx
@@ -89,7 +89,7 @@
           <w:sz w:val="28"/>
           <w:szCs w:val="28"/>
         </w:rPr>
-        <w:t>First Semester, S.Y. 2026-2027</w:t>
+        <w:t>First Semester, S.Y. ${school_year}</w:t>
       </w:r>
     </w:p>
     <w:p>
@@ -2908,7 +2908,7 @@
           <w:sz w:val="28"/>
           <w:szCs w:val="28"/>
         </w:rPr>
-        <w:t>First Semester, S.Y. 2026-2027</w:t>
+        <w:t>First Semester, S.Y. ${school_year}</w:t>
       </w:r>
     </w:p>
     <w:p>

</xml_diff>